<commit_message>
filled table and added evidences
</commit_message>
<xml_diff>
--- a/Teste_de_sistemas/Trabalhos/ATIVIDADE_TESTES_EXPLORATORIOS_VITOR_RAZIA_BUBOLS/01_plano_de_testes/Plano_de_testes_Vitor_Razia_Bubols.docx
+++ b/Teste_de_sistemas/Trabalhos/ATIVIDADE_TESTES_EXPLORATORIOS_VITOR_RAZIA_BUBOLS/01_plano_de_testes/Plano_de_testes_Vitor_Razia_Bubols.docx
@@ -526,7 +526,13 @@
     </w:p>
     <w:p>
       <w:r>
-        <w:t>EVID_&lt;BUG-ID&gt;.png</w:t>
+        <w:t>EVID_</w:t>
+      </w:r>
+      <w:r>
+        <w:t>&lt;SUITE&gt;_</w:t>
+      </w:r>
+      <w:r>
+        <w:t>&lt;ID&gt;.png</w:t>
       </w:r>
     </w:p>
     <w:p>
@@ -537,15 +543,39 @@
     <w:p>
       <w:r>
         <w:lastRenderedPageBreak/>
-        <w:t>EVID_BUG-001.png</w:t>
-      </w:r>
-      <w:r>
-        <w:br/>
-        <w:t>EVID_BUG-002.png</w:t>
-      </w:r>
-      <w:r>
-        <w:br/>
-        <w:t>EVID_BUG-003.png</w:t>
+        <w:t>EVID_</w:t>
+      </w:r>
+      <w:r>
+        <w:t>LOGIN_LOGIN-001</w:t>
+      </w:r>
+      <w:r>
+        <w:t>.png</w:t>
+      </w:r>
+      <w:r>
+        <w:br/>
+        <w:t>EVID_</w:t>
+      </w:r>
+      <w:r>
+        <w:t>ROOMS_ROOM</w:t>
+      </w:r>
+      <w:r>
+        <w:t>-002.png</w:t>
+      </w:r>
+      <w:r>
+        <w:br/>
+        <w:t>EVID_</w:t>
+      </w:r>
+      <w:r>
+        <w:t>MESSAGES_MSG</w:t>
+      </w:r>
+      <w:r>
+        <w:t>-00</w:t>
+      </w:r>
+      <w:r>
+        <w:t>1</w:t>
+      </w:r>
+      <w:r>
+        <w:t>.png</w:t>
       </w:r>
     </w:p>
     <w:p/>
@@ -1161,6 +1191,7 @@
   <w:style w:type="character" w:default="1" w:styleId="Fontepargpadro">
     <w:name w:val="Default Paragraph Font"/>
     <w:uiPriority w:val="1"/>
+    <w:semiHidden/>
     <w:unhideWhenUsed/>
   </w:style>
   <w:style w:type="table" w:default="1" w:styleId="Tabelanormal">

</xml_diff>

<commit_message>
organized files of evidences
</commit_message>
<xml_diff>
--- a/Teste_de_sistemas/Trabalhos/ATIVIDADE_TESTES_EXPLORATORIOS_VITOR_RAZIA_BUBOLS/01_plano_de_testes/Plano_de_testes_Vitor_Razia_Bubols.docx
+++ b/Teste_de_sistemas/Trabalhos/ATIVIDADE_TESTES_EXPLORATORIOS_VITOR_RAZIA_BUBOLS/01_plano_de_testes/Plano_de_testes_Vitor_Razia_Bubols.docx
@@ -12,13 +12,8 @@
     </w:p>
     <w:p>
       <w:r>
-        <w:t xml:space="preserve">Aluno: Vitor Razia </w:t>
-      </w:r>
-      <w:proofErr w:type="spellStart"/>
-      <w:r>
-        <w:t>Bubols</w:t>
-      </w:r>
-      <w:proofErr w:type="spellEnd"/>
+        <w:t>Aluno: Vitor Razia Bubols</w:t>
+      </w:r>
       <w:r>
         <w:br/>
         <w:t>Turma: DESI 2025/1</w:t>
@@ -37,23 +32,7 @@
           <w:b/>
           <w:bCs/>
         </w:rPr>
-        <w:t xml:space="preserve">Automation in </w:t>
-      </w:r>
-      <w:proofErr w:type="spellStart"/>
-      <w:r>
-        <w:rPr>
-          <w:b/>
-          <w:bCs/>
-        </w:rPr>
-        <w:t>Testing</w:t>
-      </w:r>
-      <w:proofErr w:type="spellEnd"/>
-      <w:r>
-        <w:rPr>
-          <w:b/>
-          <w:bCs/>
-        </w:rPr>
-        <w:t xml:space="preserve"> – Hotel Management System</w:t>
+        <w:t>Automation in Testing – Hotel Management System</w:t>
       </w:r>
     </w:p>
     <w:p>
@@ -72,30 +51,13 @@
       </w:r>
     </w:p>
     <w:p>
-      <w:proofErr w:type="spellStart"/>
-      <w:r>
-        <w:t>Username</w:t>
-      </w:r>
-      <w:proofErr w:type="spellEnd"/>
-      <w:r>
-        <w:t>: admin</w:t>
-      </w:r>
-      <w:r>
-        <w:br/>
-      </w:r>
-      <w:proofErr w:type="spellStart"/>
-      <w:r>
-        <w:t>Password</w:t>
-      </w:r>
-      <w:proofErr w:type="spellEnd"/>
-      <w:r>
-        <w:t xml:space="preserve">: </w:t>
-      </w:r>
-      <w:proofErr w:type="spellStart"/>
-      <w:r>
-        <w:t>password</w:t>
-      </w:r>
-      <w:proofErr w:type="spellEnd"/>
+      <w:r>
+        <w:t>Username: admin</w:t>
+      </w:r>
+      <w:r>
+        <w:br/>
+        <w:t>Password: password</w:t>
+      </w:r>
     </w:p>
     <w:p/>
     <w:p>
@@ -362,17 +324,7 @@
     <w:p>
       <w:r>
         <w:lastRenderedPageBreak/>
-        <w:t>Navegação</w:t>
-      </w:r>
-    </w:p>
-    <w:p>
-      <w:r>
-        <w:t>• Verificar navegação entre páginas do painel administrativo</w:t>
-      </w:r>
-    </w:p>
-    <w:p>
-      <w:r>
-        <w:t>Gerenciamento de quartos</w:t>
+        <w:t>Rooms</w:t>
       </w:r>
     </w:p>
     <w:p>
@@ -381,48 +333,72 @@
       </w:r>
       <w:r>
         <w:br/>
-      </w:r>
-      <w:proofErr w:type="gramStart"/>
-      <w:r>
-        <w:t>• Criar</w:t>
-      </w:r>
-      <w:proofErr w:type="gramEnd"/>
-      <w:r>
-        <w:t xml:space="preserve"> novo quarto</w:t>
-      </w:r>
-      <w:r>
-        <w:br/>
-        <w:t>• Inserir dados inválidos no cadastro de quarto</w:t>
-      </w:r>
-    </w:p>
-    <w:p>
-      <w:r>
-        <w:t>Reservas</w:t>
-      </w:r>
-    </w:p>
-    <w:p>
-      <w:r>
-        <w:t>• Visualizar reservas cadastradas</w:t>
-      </w:r>
-    </w:p>
-    <w:p>
-      <w:r>
-        <w:t>Mensagens</w:t>
-      </w:r>
-    </w:p>
-    <w:p>
-      <w:r>
-        <w:t>• Visualizar mensagens enviadas pelo formulário de contato</w:t>
-      </w:r>
-    </w:p>
-    <w:p>
-      <w:r>
-        <w:t>Usabilidade</w:t>
-      </w:r>
-    </w:p>
-    <w:p>
-      <w:r>
-        <w:t>• Verificar feedback visual após ações realizadas no sistema</w:t>
+        <w:t>• Criar novo quarto</w:t>
+      </w:r>
+      <w:r>
+        <w:br/>
+        <w:t xml:space="preserve">• </w:t>
+      </w:r>
+      <w:r>
+        <w:t>Criar quarto com</w:t>
+      </w:r>
+      <w:r>
+        <w:t xml:space="preserve"> dados inválidos</w:t>
+      </w:r>
+    </w:p>
+    <w:p>
+      <w:r>
+        <w:t>Booking</w:t>
+      </w:r>
+    </w:p>
+    <w:p>
+      <w:r>
+        <w:t>• Visualizar reservas</w:t>
+      </w:r>
+      <w:r>
+        <w:t xml:space="preserve"> existentes</w:t>
+      </w:r>
+    </w:p>
+    <w:p>
+      <w:r>
+        <w:t>Mes</w:t>
+      </w:r>
+      <w:r>
+        <w:t>sages</w:t>
+      </w:r>
+    </w:p>
+    <w:p>
+      <w:r>
+        <w:t xml:space="preserve">• Visualizar mensagens </w:t>
+      </w:r>
+      <w:r>
+        <w:t>recebidas</w:t>
+      </w:r>
+    </w:p>
+    <w:p>
+      <w:r>
+        <w:t>Interface</w:t>
+      </w:r>
+    </w:p>
+    <w:p>
+      <w:r>
+        <w:t xml:space="preserve">• Verificar </w:t>
+      </w:r>
+      <w:r>
+        <w:t>responsividade das páginas</w:t>
+      </w:r>
+    </w:p>
+    <w:p>
+      <w:r>
+        <w:t>Performance</w:t>
+      </w:r>
+    </w:p>
+    <w:p>
+      <w:r>
+        <w:t>•</w:t>
+      </w:r>
+      <w:r>
+        <w:t xml:space="preserve"> Avaliar tempo de carregamento das páginas</w:t>
       </w:r>
     </w:p>
     <w:p>
@@ -485,14 +461,7 @@
       </w:r>
       <w:r>
         <w:br/>
-      </w:r>
-      <w:proofErr w:type="gramStart"/>
-      <w:r>
-        <w:t>• Ocorre</w:t>
-      </w:r>
-      <w:proofErr w:type="gramEnd"/>
-      <w:r>
-        <w:t xml:space="preserve"> erro de sistema ou comportamento inesperado</w:t>
+        <w:t>• Ocorre erro de sistema ou comportamento inesperado</w:t>
       </w:r>
     </w:p>
     <w:p/>

</xml_diff>